<commit_message>
docs: actualizar estado del proyecto y propuesta; agregar notebook EDA
</commit_message>
<xml_diff>
--- a/docs/03_propuesta_corregida.docx
+++ b/docs/03_propuesta_corregida.docx
@@ -21,9 +21,6 @@
           <w:pPr>
             <w:pStyle w:val="TtuloTDC"/>
           </w:pPr>
-          <w:r>
-            <w:t>Table of Contents</w:t>
-          </w:r>
         </w:p>
         <w:p>
           <w:r>
@@ -3204,7 +3201,25 @@
           <w:iCs/>
           <w:highlight w:val="yellow"/>
         </w:rPr>
-        <w:t xml:space="preserve">Ilustración 2. Arquitectura de </w:t>
+        <w:t xml:space="preserve">Ilustración 2. </w:t>
+      </w:r>
+      <w:proofErr w:type="spellStart"/>
+      <w:r>
+        <w:rPr>
+          <w:i/>
+          <w:iCs/>
+          <w:highlight w:val="yellow"/>
+        </w:rPr>
+        <w:t>Arquitectura</w:t>
+      </w:r>
+      <w:proofErr w:type="spellEnd"/>
+      <w:r>
+        <w:rPr>
+          <w:i/>
+          <w:iCs/>
+          <w:highlight w:val="yellow"/>
+        </w:rPr>
+        <w:t xml:space="preserve"> de </w:t>
       </w:r>
       <w:proofErr w:type="spellStart"/>
       <w:r>
@@ -5012,6 +5027,7 @@
   <w:style w:type="character" w:default="1" w:styleId="Fuentedeprrafopredeter">
     <w:name w:val="Default Paragraph Font"/>
     <w:uiPriority w:val="1"/>
+    <w:semiHidden/>
     <w:unhideWhenUsed/>
   </w:style>
   <w:style w:type="table" w:default="1" w:styleId="Tablanormal">

</xml_diff>